<commit_message>
Ch15 v1 review: cuts, 'Clear' defined, pulse logic, the-way trims
Co-Authored-By: Claude Opus 5.5 <noreply@anthropic.com>
</commit_message>
<xml_diff>
--- a/claude-notes/manuscript-v2/15-now-rehearsal-merged.docx
+++ b/claude-notes/manuscript-v2/15-now-rehearsal-merged.docx
@@ -113,7 +113,7 @@
           <w:i w:val="0"/>
           <w:strike w:val="0"/>
         </w:rPr>
-        <w:t>She thought about the egg. The metal fingers came round it a third of a breath behind her, closed, lifted. It sat in the grey palm, whole. The hand had done it. She had done it. She couldn't say any more where one of those ended. She set it down on the rag. The engineer said nothing, which from him was a speech.</w:t>
+        <w:t>She thought about the egg. The metal fingers came round it a third of a breath behind her, closed, lifted. It sat in the grey palm, whole. The hand had done it. She had done it. She couldn't say any more where one of those ended. She set it down on the rag. The engineer nodded once.</w:t>
       </w:r>
     </w:p>
     <w:p>
@@ -293,7 +293,7 @@
           <w:i w:val="0"/>
           <w:strike w:val="0"/>
         </w:rPr>
-        <w:t>"Eleven," Ben said. "He scratches his neck before he hands the board over. Every time. Then nobody's looking at the gauges for eleven seconds." He pointed without touching the glass. "That one, on the turbine floor, he's slower. He talks to the new man about his kid. Sixteen, if the kid's sick. Nine if he's not."</w:t>
+        <w:t>"Eleven," Ben said. "He scratches his neck before he hands the board over. Every time. Then nobody's looking at the gauges for eleven seconds." He pointed without touching the glass. "That one, on the turbine floor, he's slower. He talks to the new man about his kid. Sixteen, if the kid's sick. Nine if he's not. Clear is when he's off the floor."</w:t>
       </w:r>
     </w:p>
     <w:p>
@@ -483,17 +483,7 @@
           <w:i w:val="0"/>
           <w:strike w:val="0"/>
         </w:rPr>
-        <w:t>"Wait," he said. "No. Sorry. He's slow. The turbine man. It's the kid." He shut his eyes again. "Clear now."</w:t>
-      </w:r>
-    </w:p>
-    <w:p>
-      <w:r>
-        <w:rPr>
-          <w:b w:val="0"/>
-          <w:i w:val="0"/>
-          <w:strike w:val="0"/>
-        </w:rPr>
-        <w:t>Two minutes of sand had run while they waited for a man who didn't exist.</w:t>
+        <w:t>"Wait," he said. "No. Sorry. He's slow. The turbine man. It's the kid." He shut his eyes again. They waited. The sand ran. "Clear," he said at last, and two minutes had gone on a sick kid nobody had invented.</w:t>
       </w:r>
     </w:p>
     <w:p>
@@ -633,7 +623,7 @@
           <w:i w:val="0"/>
           <w:strike w:val="0"/>
         </w:rPr>
-        <w:t>She looked at Gage's hand while the engineer turned the glass over. He'd taken it off the model. He'd laid it open on the bench, the way he'd been keeping it, and as the sand began to fall it went back on its own, down the right side of the mountain, the feeds, the Hub, and on along the wall to the split splinter.</w:t>
+        <w:t>She looked at Gage's hand while the engineer turned the glass over. He'd taken it off the model. He'd laid it open on the bench, and as the sand began to fall it went back on its own, down the right side of the mountain, the feeds, the Hub, and on along the wall to the split splinter.</w:t>
       </w:r>
     </w:p>
     <w:p>
@@ -643,17 +633,7 @@
           <w:i w:val="0"/>
           <w:strike w:val="0"/>
         </w:rPr>
-        <w:t>It had ended there every time: the run where Ben hesitated, the run where Gage lost the count, the run where she'd killed a man who wasn't real. The three of them were rehearsing three jobs, and his finger was rehearsing a fourth.</w:t>
-      </w:r>
-    </w:p>
-    <w:p>
-      <w:r>
-        <w:rPr>
-          <w:b w:val="0"/>
-          <w:i w:val="0"/>
-          <w:strike w:val="0"/>
-        </w:rPr>
-        <w:t>Nobody said that either.</w:t>
+        <w:t>It had ended there every time: the run where Ben hesitated, the run where Gage lost the count, the run where she'd killed a man who wasn't real.</w:t>
       </w:r>
     </w:p>
     <w:p>
@@ -683,7 +663,7 @@
           <w:i w:val="0"/>
           <w:strike w:val="0"/>
         </w:rPr>
-        <w:t>It was. Nobody late, nobody early, and on the model the water ran lake to pods the way it was supposed to, past a split splinter where a finger had been and wasn't now.</w:t>
+        <w:t>It was. Nobody late, nobody early, and on the model the water ran lake to pods on schedule, past a split splinter where a finger had been and wasn't now.</w:t>
       </w:r>
     </w:p>
     <w:p>
@@ -723,7 +703,7 @@
           <w:i w:val="0"/>
           <w:strike w:val="0"/>
         </w:rPr>
-        <w:t>The crystal was still in the room where they'd woken, which had been every room, because nobody had found a way to move it, or nobody had wanted to.</w:t>
+        <w:t>The crystal was still in the room where they'd woken, the same room every trial had turned out to be, because nobody had found a way to move it, or nobody had wanted to.</w:t>
       </w:r>
     </w:p>
     <w:p>
@@ -763,7 +743,7 @@
           <w:i w:val="0"/>
           <w:strike w:val="0"/>
         </w:rPr>
-        <w:t>It pulsed. She'd seen it pulse the night they woke here, and thought of it the way you think of a lamp, a thing that's on. Sitting there, she saw it brighten, and dim, and brighten, and Ben's lips moving with it. After a while she started to count too. Twelve, and the next one took thirteen. Thirteen. Fourteen. The pulse was getting slower.</w:t>
+        <w:t>It pulsed. She'd seen it pulse the night they woke here, and thought of it as a lamp, a thing that's on. Sitting there, she saw it brighten, and dim, and brighten, and Ben's lips moving with it. After a while she started to count too. Twelve, and the next one took thirteen. Thirteen. Fourteen. The pulse was getting slower.</w:t>
       </w:r>
     </w:p>
     <w:p>
@@ -793,7 +773,7 @@
           <w:i w:val="0"/>
           <w:strike w:val="0"/>
         </w:rPr>
-        <w:t>He didn't answer. He didn't have to. She was already seeing it: a tank on the level above, the gel inside going pale and then deeper and then pale, warm and then cool, slow as a tide. The pulse in front of her slowed, and slowed, and she knew without looking at anything that upstairs the cool was coming in. Or that Otto's chest was rising on a long breath, the long one that came every few minutes, when his body seemed to remember it had lungs.</w:t>
+        <w:t>He didn't answer. He didn't have to. She was already seeing it: a tank on the level above, the gel inside going pale and then deeper and then pale, warm and then cool, slow as a tide. The pulse in front of her slowed, and slowed, and she knew without looking at anything that upstairs the cool was coming in. Or that something in Otto was turning over on its own slow clock, and the gel only followed.</w:t>
       </w:r>
     </w:p>
     <w:p>
@@ -923,7 +903,7 @@
           <w:i w:val="0"/>
           <w:strike w:val="0"/>
         </w:rPr>
-        <w:t>"There is an old astronomers' lesson," he said. "A black hole. You cannot see it. You find it only by the way light bends around what cannot be seen." He turned back to the crystal. "I have been looking at that bend for a long time, Ben. It is good to have someone else look."</w:t>
+        <w:t>"Yes," he said. "Everything bends round it. I have been looking at the bend for a long time."</w:t>
       </w:r>
     </w:p>
     <w:p>
@@ -1093,7 +1073,7 @@
           <w:i w:val="0"/>
           <w:strike w:val="0"/>
         </w:rPr>
-        <w:t>Ben had stopped in the middle of the sentence. He was sitting with his mouth still open on the next word. He hadn't turned his head to the screen; he'd been looking at Otto's face, the way he always did. But he'd seen it the same way she had, out of the side of everything. She watched his hands on his knees. They'd gone completely still, the way they went when a coil hummed under them after an hour of nothing.</w:t>
+        <w:t>Ben had stopped in the middle of the sentence. He was sitting with his mouth still open on the next word. He hadn't turned his head to the screen; he'd been looking at Otto's face, as he always did. But he'd seen it the same way she had, out of the side of everything. She watched his hands on his knees. They'd gone completely still, the way they went when a coil hummed under them after an hour of nothing.</w:t>
       </w:r>
     </w:p>
     <w:p>
@@ -1113,23 +1093,7 @@
           <w:i w:val="0"/>
           <w:strike w:val="0"/>
         </w:rPr>
-        <w:t xml:space="preserve">Camilla looked at her. The woman didn't look up. She sat with her pen above the paper, and then she set it down, and wrote one line, short, and blotted it, and turned the page over, and went on with what she'd been writing before. Her face did nothing at all. Camilla understood that </w:t>
-      </w:r>
-      <w:r>
-        <w:rPr>
-          <w:b w:val="0"/>
-          <w:i/>
-          <w:strike w:val="0"/>
-        </w:rPr>
-        <w:t>exact</w:t>
-      </w:r>
-      <w:r>
-        <w:rPr>
-          <w:b w:val="0"/>
-          <w:i w:val="0"/>
-          <w:strike w:val="0"/>
-        </w:rPr>
-        <w:t xml:space="preserve"> meant you wrote down one rise and didn't call it anything yet.</w:t>
+        <w:t>Camilla looked at her. The woman didn't look up. She sat with her pen above the paper, and then she set it down, and wrote one line, short, and blotted it, and turned the page over, and went on with what she'd been writing before. Her face did nothing at all. Camilla understood what that meant: you wrote down one rise and didn't call it anything yet.</w:t>
       </w:r>
     </w:p>
     <w:p>
@@ -1159,7 +1123,7 @@
           <w:i w:val="0"/>
           <w:strike w:val="0"/>
         </w:rPr>
-        <w:t>He left the gap. The same length. Camilla counted it, and it was the same length to the beat, as if he'd measured it against something.</w:t>
+        <w:t>He left the gap. The same length. Camilla counted it: the same length to the beat.</w:t>
       </w:r>
     </w:p>
     <w:p>
@@ -1245,7 +1209,7 @@
           <w:i w:val="0"/>
           <w:strike w:val="0"/>
         </w:rPr>
-        <w:t xml:space="preserve"> and watch his whole face come apart and go back together again, and he'd be up those stairs before she'd finished the sentence. He'd been told the first time, and he'd sat in that chair all night, and nothing had moved for him. Twice was still a reading. She'd learned that before she learned her letters, on Pappy's gauges: a needle that kicks goes in the log, and you wait on it. You don't hand it to someone who has twelve nights and a finger that keeps going to the same place on the wall.</w:t>
+        <w:t xml:space="preserve"> and watch his whole face come apart and go back together again, and he'd be up those stairs before she'd finished the sentence. He'd been told the first time, and he'd sat in that chair all night, and nothing had moved again. Twice was still a reading. She'd learned that before she learned her letters, on Pappy's gauges: a needle that kicks goes in the log, and you wait on it. You don't hand it to someone who has twelve nights and a finger that keeps going to the same place on the wall.</w:t>
       </w:r>
     </w:p>
     <w:p>
@@ -1256,16 +1220,6 @@
           <w:strike w:val="0"/>
         </w:rPr>
         <w:t>Or it was the only thing that would make him take the finger off the wall.</w:t>
-      </w:r>
-    </w:p>
-    <w:p>
-      <w:r>
-        <w:rPr>
-          <w:b w:val="0"/>
-          <w:i w:val="0"/>
-          <w:strike w:val="0"/>
-        </w:rPr>
-        <w:t>She didn't know which, the same way she didn't know which it was in the crystal, the tank or the breath. This place kept giving her two answers and no way to take either apart.</w:t>
       </w:r>
     </w:p>
     <w:p>

</xml_diff>

<commit_message>
Ch15 v2 fixes: run 1 hesitation before the feeds; dark corridor count; trims; Flitzberg's bend reply cut
Co-Authored-By: Claude Opus 5.5 <noreply@anthropic.com>
</commit_message>
<xml_diff>
--- a/claude-notes/manuscript-v2/15-now-rehearsal-merged.docx
+++ b/claude-notes/manuscript-v2/15-now-rehearsal-merged.docx
@@ -163,7 +163,7 @@
           <w:i w:val="0"/>
           <w:strike w:val="0"/>
         </w:rPr>
-        <w:t>At the far end of the same bench, under a cloth, sat the other thing: a coil wound on a spindle of old pipe, a plate of clay for it to sit in, a needle that was meant to jump when the clay shook. The listener, for the wall. She'd tapped the clay with a spanner a hundred times this week, and the needle had jumped for the spanner and for her own footsteps and for Gage shutting a drawer two rooms away. It couldn't yet tell rock from anything else.</w:t>
+        <w:t>At the far end of the same bench, under a cloth, sat the other thing: a coil wound on a spindle of old pipe, a plate of clay for it to sit in, a needle that was meant to jump when the clay shook. The listener, for the wall. She'd tapped the clay with a spanner a hundred times this week, and the needle had jumped for the spanner and for her own footsteps and for Gage shutting a drawer two rooms away. It couldn't yet tell rock from anything else. If it ever could, nobody would have to stand at the junction.</w:t>
       </w:r>
     </w:p>
     <w:p>
@@ -193,7 +193,7 @@
           <w:i w:val="0"/>
           <w:strike w:val="0"/>
         </w:rPr>
-        <w:t>She stood at the end and watched him walk it. He'd asked for the lights off, and somebody had done it without asking why. He went with his left hand flat on the wall and his eyes shut. The wall was smooth grey, nothing on it. His fingers moved along it the way they'd move along timbers.</w:t>
+        <w:t>She stood at the end and watched him walk it. He'd asked for the lights off, and somebody had done it without asking why. He went with his left hand flat on the wall and his eyes shut. The wall was smooth grey, nothing on it. His fingers moved along it, testing for splits.</w:t>
       </w:r>
     </w:p>
     <w:p>
@@ -223,7 +223,7 @@
           <w:i w:val="0"/>
           <w:strike w:val="0"/>
         </w:rPr>
-        <w:t>At the far end of the corridor his hand stopped on the wall and stayed there, pressing, fingers spread. That was the junction. She knew the count without hearing it. Gage's lips had made thirty-one.</w:t>
+        <w:t>At the far end of the corridor his hand stopped on the wall and stayed there, pressing, fingers spread. That was the junction. In the dark she caught the last number, barely a breath: "Thirty-one."</w:t>
       </w:r>
     </w:p>
     <w:p>
@@ -413,7 +413,7 @@
           <w:i w:val="0"/>
           <w:strike w:val="0"/>
         </w:rPr>
-        <w:t>"Clear," Ben said.</w:t>
+        <w:t>"Wait," Ben said. "No. Sorry. He's slow. The turbine man. It's the kid." They waited. The sand ran. "Clear," he said at last, and two minutes had gone on a sick kid who only lived in Ben's head.</w:t>
       </w:r>
     </w:p>
     <w:p>
@@ -473,17 +473,7 @@
           <w:i w:val="0"/>
           <w:strike w:val="0"/>
         </w:rPr>
-        <w:t>It went on like that, the four of them trading words over the clay. At six minutes Ben opened his eyes.</w:t>
-      </w:r>
-    </w:p>
-    <w:p>
-      <w:r>
-        <w:rPr>
-          <w:b w:val="0"/>
-          <w:i w:val="0"/>
-          <w:strike w:val="0"/>
-        </w:rPr>
-        <w:t>"Wait," he said. "No. Sorry. He's slow. The turbine man. It's the kid." He shut his eyes again. They waited. The sand ran. "Clear," he said at last, and two minutes had gone on a sick kid nobody had invented.</w:t>
+        <w:t>It went on like that, the four of them trading words over the clay, until the sand ran out with the wall still standing.</w:t>
       </w:r>
     </w:p>
     <w:p>
@@ -603,7 +593,7 @@
           <w:i w:val="0"/>
           <w:strike w:val="0"/>
         </w:rPr>
-        <w:t>She could see him, the grey picture on the top row, a man laughing at the start of a sentence because his kid was well. Standing on the floor the water would want second.</w:t>
+        <w:t>She could see him, the grey picture on the top row, a man laughing at the start of a sentence because his kid was well. He was standing on the floor the water would reach second.</w:t>
       </w:r>
     </w:p>
     <w:p>
@@ -833,7 +823,7 @@
           <w:i w:val="0"/>
           <w:strike w:val="0"/>
         </w:rPr>
-        <w:t>"Yes," he said. "I had seen that it moved. I had not seen with what." He kept his hands folded. "I will tell you the next part, because you will ask it. I do not know why. I do not know what it is doing."</w:t>
+        <w:t>"Yes," he said. "I had seen that it moved. I had not seen with what." He kept his hands folded. "I do not know why. I do not know what it is doing."</w:t>
       </w:r>
     </w:p>
     <w:p>
@@ -894,16 +884,6 @@
           <w:strike w:val="0"/>
         </w:rPr>
         <w:t>Flitzberg turned his head and looked at Ben in a way Camilla hadn't seen yet, the look he gave the dolls.</w:t>
-      </w:r>
-    </w:p>
-    <w:p>
-      <w:r>
-        <w:rPr>
-          <w:b w:val="0"/>
-          <w:i w:val="0"/>
-          <w:strike w:val="0"/>
-        </w:rPr>
-        <w:t>"Yes," he said. "Everything bends round it. I have been looking at the bend for a long time."</w:t>
       </w:r>
     </w:p>
     <w:p>
@@ -1073,7 +1053,7 @@
           <w:i w:val="0"/>
           <w:strike w:val="0"/>
         </w:rPr>
-        <w:t>Ben had stopped in the middle of the sentence. He was sitting with his mouth still open on the next word. He hadn't turned his head to the screen; he'd been looking at Otto's face, as he always did. But he'd seen it the same way she had, out of the side of everything. She watched his hands on his knees. They'd gone completely still, the way they went when a coil hummed under them after an hour of nothing.</w:t>
+        <w:t>Ben had stopped in the middle of the sentence. He was sitting with his mouth still open on the next word. He hadn't turned his head to the screen; he'd been looking at Otto's face, as he always did. But he'd seen it the same way she had, out of the side of everything. She watched his hands on his knees. They'd gone completely still.</w:t>
       </w:r>
     </w:p>
     <w:p>
@@ -1093,7 +1073,7 @@
           <w:i w:val="0"/>
           <w:strike w:val="0"/>
         </w:rPr>
-        <w:t>Camilla looked at her. The woman didn't look up. She sat with her pen above the paper, and then she set it down, and wrote one line, short, and blotted it, and turned the page over, and went on with what she'd been writing before. Her face did nothing at all. Camilla understood what that meant: you wrote down one rise and didn't call it anything yet.</w:t>
+        <w:t>Camilla looked at her. The woman didn't look up. She sat with her pen above the paper, and then she set it down, and wrote one line, short, and blotted it, and turned the page over, and went on with what she'd been writing before. Her face did nothing at all.</w:t>
       </w:r>
     </w:p>
     <w:p>

</xml_diff>

<commit_message>
Ch15 final: Your finger / It goes there; dolls look; Cami says; last line on an action; pulse unit
Co-Authored-By: Claude Opus 5.5 <noreply@anthropic.com>
</commit_message>
<xml_diff>
--- a/claude-notes/manuscript-v2/15-now-rehearsal-merged.docx
+++ b/claude-notes/manuscript-v2/15-now-rehearsal-merged.docx
@@ -323,7 +323,7 @@
           <w:i w:val="0"/>
           <w:strike w:val="0"/>
         </w:rPr>
-        <w:t>"He doesn't laugh at the start." Ben's hand had gone to his hip and pressed flat over the pocket that wasn't there. "I'm good at this, Cami. I don't like it. I'm not watching people anymore, I'm watching the holes between them." He watched the man on the turbine floor laugh, a short one, and the gap close. "They're just going home."</w:t>
+        <w:t>"He doesn't laugh at the start." Ben's hand had gone to his hip and pressed flat over the pocket that wasn't there. "I'm good at this, Cami. I don't like it." He watched the man on the turbine floor laugh, a short one, and the gap close. "They're just going home."</w:t>
       </w:r>
     </w:p>
     <w:p>
@@ -663,7 +663,7 @@
           <w:i w:val="0"/>
           <w:strike w:val="0"/>
         </w:rPr>
-        <w:t>She wished one of them had got it wrong.</w:t>
+        <w:t>"Your finger," she said.</w:t>
       </w:r>
     </w:p>
     <w:p>
@@ -673,7 +673,7 @@
           <w:i w:val="0"/>
           <w:strike w:val="0"/>
         </w:rPr>
-        <w:t>Gage looked at the pad of his finger. There was a small pale line on it where the split edge had pressed. He put the hand flat on the bench, open, and then he swept the splinters into the box with the side of it. He pressed the clay flat. He didn't start again, which he always did, and she didn't ask him why.</w:t>
+        <w:t>Gage looked at the pad of his finger. There was a small pale line on it where the split edge had pressed. "It goes there," he said, and swept the splinters into the box with the side of his hand. He pressed the clay flat. He didn't start again, which he always did, and she didn't ask him why.</w:t>
       </w:r>
     </w:p>
     <w:p>
@@ -733,7 +733,7 @@
           <w:i w:val="0"/>
           <w:strike w:val="0"/>
         </w:rPr>
-        <w:t>It pulsed. She'd seen it pulse the night they woke here, and thought of it as a lamp, a thing that's on. Sitting there, she saw it brighten, and dim, and brighten, and Ben's lips moving with it. After a while she started to count too. Twelve, and the next one took thirteen. Thirteen. Fourteen. The pulse was getting slower.</w:t>
+        <w:t>It pulsed. She'd seen it pulse the night they woke here, and thought of it as a lamp, a thing that's on. Sitting there, she saw it brighten, and dim, and brighten, and Ben's lips moving with it. After a while she counted too, under her breath, the seconds between pulses. Twelve. Thirteen. Fourteen. The pulse was getting slower.</w:t>
       </w:r>
     </w:p>
     <w:p>
@@ -883,7 +883,7 @@
           <w:i w:val="0"/>
           <w:strike w:val="0"/>
         </w:rPr>
-        <w:t>Flitzberg turned his head and looked at Ben in a way Camilla hadn't seen yet, the look he gave the dolls.</w:t>
+        <w:t>Flitzberg turned his head and looked at Ben the way she had only seen him look at the dolls.</w:t>
       </w:r>
     </w:p>
     <w:p>
@@ -953,7 +953,7 @@
           <w:i w:val="0"/>
           <w:strike w:val="0"/>
         </w:rPr>
-        <w:t>"Gage did the corridor again today," he said. "With the lights off. He ducked under a beam that isn't there. He'd hate me telling you that."</w:t>
+        <w:t>"Cami says Gage did the corridor again today," he said. "With the lights off. He ducked under a beam that isn't there. He'd hate me telling you that."</w:t>
       </w:r>
     </w:p>
     <w:p>
@@ -1189,7 +1189,7 @@
           <w:i w:val="0"/>
           <w:strike w:val="0"/>
         </w:rPr>
-        <w:t xml:space="preserve"> and watch his whole face come apart and go back together again, and he'd be up those stairs before she'd finished the sentence. He'd been told the first time, and he'd sat in that chair all night, and nothing had moved again. Twice was still a reading. She'd learned that before she learned her letters, on Pappy's gauges: a needle that kicks goes in the log, and you wait on it. You don't hand it to someone who has twelve nights and a finger that keeps going to the same place on the wall.</w:t>
+        <w:t xml:space="preserve"> and watch his whole face come apart and go back together again, and he'd be up those stairs before she'd finished the sentence. He'd been told the first time, and he'd sat in that chair all night, and nothing had moved again. Twice was still a reading. She'd learned that before she learned her letters, on Pappy's gauges: a needle that kicks goes in the log, and you wait on it.</w:t>
       </w:r>
     </w:p>
     <w:p>
@@ -1219,7 +1219,7 @@
           <w:i w:val="0"/>
           <w:strike w:val="0"/>
         </w:rPr>
-        <w:t>She counted the props he set down after that. She got to thirty-one, standing in the door, with the egg yolk still dried in the grooves of her knuckles, and she didn't go in, and she didn't go away, and she counted the gap she was leaving and couldn't find the end of it.</w:t>
+        <w:t>She counted the props he set down after that. She got to thirty-one, standing in the door, with the egg yolk still dried in the grooves of her knuckles, and she didn't go in, and she didn't go away. Thirty-two. He was still setting them down.</w:t>
       </w:r>
     </w:p>
     <w:sectPr>

</xml_diff>

<commit_message>
Ch15: Ben leaves it in the gap; tunnel line; counting pulses; Not here
Co-Authored-By: Claude Opus 5.5 <noreply@anthropic.com>
</commit_message>
<xml_diff>
--- a/claude-notes/manuscript-v2/15-now-rehearsal-merged.docx
+++ b/claude-notes/manuscript-v2/15-now-rehearsal-merged.docx
@@ -713,7 +713,7 @@
           <w:i w:val="0"/>
           <w:strike w:val="0"/>
         </w:rPr>
-        <w:t>"Sit down," Ben said. "Don't talk. I'm at two hundred and six."</w:t>
+        <w:t>"Sit down," Ben said. "Don't talk. I'm counting pulses. I'm at two hundred and six."</w:t>
       </w:r>
     </w:p>
     <w:p>
@@ -883,7 +883,7 @@
           <w:i w:val="0"/>
           <w:strike w:val="0"/>
         </w:rPr>
-        <w:t>Flitzberg turned his head and looked at Ben the way she had only seen him look at the dolls.</w:t>
+        <w:t>Flitzberg turned his head and looked at Ben the way she had only seen him look at the dolls. "Not here," he said.</w:t>
       </w:r>
     </w:p>
     <w:p>
@@ -1173,7 +1173,7 @@
           <w:i w:val="0"/>
           <w:strike w:val="0"/>
         </w:rPr>
-        <w:t xml:space="preserve">She could tell him. She could walk in and say </w:t>
+        <w:t xml:space="preserve">Ben wouldn't tell him. Ben would leave it in the gap, where he left everything. She could tell him. She could walk in and say </w:t>
       </w:r>
       <w:r>
         <w:rPr>
@@ -1199,7 +1199,7 @@
           <w:i w:val="0"/>
           <w:strike w:val="0"/>
         </w:rPr>
-        <w:t>Or it was the only thing that would make him take the finger off the wall.</w:t>
+        <w:t>Or it was the only thing that might make him walk back out of that tunnel.</w:t>
       </w:r>
     </w:p>
     <w:p>

</xml_diff>